<commit_message>
Correct creating file heading
</commit_message>
<xml_diff>
--- a/test.docx
+++ b/test.docx
@@ -7,7 +7,7 @@
         <w:jc w:val="center"/>
       </w:pPr>
       <w:r>
-        <w:t>Sigma</w:t>
+        <w:t>Supertest</w:t>
       </w:r>
     </w:p>
     <w:p>
@@ -20,12 +20,12 @@
     </w:p>
     <w:p>
       <w:r>
-        <w:t>1. Какая звезда альфа Волопаса?</w:t>
-      </w:r>
-    </w:p>
-    <w:p>
-      <w:r>
-        <w:t>1) Капелла</w:t>
+        <w:t>1. Какая звезда альфа Больших псов?</w:t>
+      </w:r>
+    </w:p>
+    <w:p>
+      <w:r>
+        <w:t>1) Арктур</w:t>
       </w:r>
     </w:p>
     <w:p>
@@ -35,7 +35,7 @@
     </w:p>
     <w:p>
       <w:r>
-        <w:t>3) Спика</w:t>
+        <w:t>3) Капелла</w:t>
       </w:r>
     </w:p>
     <w:p>
@@ -45,32 +45,67 @@
     </w:p>
     <w:p>
       <w:r>
-        <w:t>5) Арктур</w:t>
-      </w:r>
-    </w:p>
-    <w:p>
-      <w:r>
-        <w:t>2. В каком созвездии находится сверхскопление галактик?</w:t>
-      </w:r>
-    </w:p>
-    <w:p>
-      <w:r>
-        <w:t>1) Дева</w:t>
-      </w:r>
-    </w:p>
-    <w:p>
-      <w:r>
-        <w:t>2) Волопас</w:t>
-      </w:r>
-    </w:p>
-    <w:p>
-      <w:r>
-        <w:t>3) Большая медведица</w:t>
-      </w:r>
-    </w:p>
-    <w:p>
-      <w:r>
-        <w:t>4) Эридан</w:t>
+        <w:t>2. Какой объект находится в каталоге Мессье под номером 45?</w:t>
+      </w:r>
+    </w:p>
+    <w:p>
+      <w:r>
+        <w:t>1) Туманность Кошачий глаз</w:t>
+      </w:r>
+    </w:p>
+    <w:p>
+      <w:r>
+        <w:t>2) Туманность Ориона</w:t>
+      </w:r>
+    </w:p>
+    <w:p>
+      <w:r>
+        <w:t>3) Гиады</w:t>
+      </w:r>
+    </w:p>
+    <w:p>
+      <w:r>
+        <w:t>4) Плеяды</w:t>
+      </w:r>
+    </w:p>
+    <w:p>
+      <w:r>
+        <w:t>5) Туманность Андромеды</w:t>
+      </w:r>
+    </w:p>
+    <w:p>
+      <w:r>
+        <w:t>6) Крабовидная туманность</w:t>
+      </w:r>
+    </w:p>
+    <w:p>
+      <w:r>
+        <w:t>3. Какая звезда альфа Волопаса?</w:t>
+      </w:r>
+    </w:p>
+    <w:p>
+      <w:r>
+        <w:t>1) Сириус</w:t>
+      </w:r>
+    </w:p>
+    <w:p>
+      <w:r>
+        <w:t>2) Капелла</w:t>
+      </w:r>
+    </w:p>
+    <w:p>
+      <w:r>
+        <w:t>3) Арктур</w:t>
+      </w:r>
+    </w:p>
+    <w:p>
+      <w:r>
+        <w:t>4) Фомальгаут</w:t>
+      </w:r>
+    </w:p>
+    <w:p>
+      <w:r>
+        <w:t>5) Спика</w:t>
       </w:r>
     </w:p>
     <w:p>
@@ -83,7 +118,7 @@
         <w:jc w:val="center"/>
       </w:pPr>
       <w:r>
-        <w:t>Sigma</w:t>
+        <w:t>Supertest</w:t>
       </w:r>
     </w:p>
     <w:p>
@@ -96,7 +131,42 @@
     </w:p>
     <w:p>
       <w:r>
-        <w:t>1. В каком созвездии находится сверхскопление галактик?</w:t>
+        <w:t>1. Какой объект находится в каталоге Мессье под номером 45?</w:t>
+      </w:r>
+    </w:p>
+    <w:p>
+      <w:r>
+        <w:t>1) Туманность Кошачий глаз</w:t>
+      </w:r>
+    </w:p>
+    <w:p>
+      <w:r>
+        <w:t>2) Крабовидная туманность</w:t>
+      </w:r>
+    </w:p>
+    <w:p>
+      <w:r>
+        <w:t>3) Туманность Ориона</w:t>
+      </w:r>
+    </w:p>
+    <w:p>
+      <w:r>
+        <w:t>4) Туманность Андромеды</w:t>
+      </w:r>
+    </w:p>
+    <w:p>
+      <w:r>
+        <w:t>5) Гиады</w:t>
+      </w:r>
+    </w:p>
+    <w:p>
+      <w:r>
+        <w:t>6) Плеяды</w:t>
+      </w:r>
+    </w:p>
+    <w:p>
+      <w:r>
+        <w:t>2. В каком созвездии находится сверхскопление галактик?</w:t>
       </w:r>
     </w:p>
     <w:p>
@@ -106,42 +176,42 @@
     </w:p>
     <w:p>
       <w:r>
-        <w:t>2) Дева</w:t>
-      </w:r>
-    </w:p>
-    <w:p>
-      <w:r>
-        <w:t>3) Эридан</w:t>
-      </w:r>
-    </w:p>
-    <w:p>
-      <w:r>
-        <w:t>4) Волопас</w:t>
-      </w:r>
-    </w:p>
-    <w:p>
-      <w:r>
-        <w:t>2. Какая звезда альфа Южной рыбы?</w:t>
-      </w:r>
-    </w:p>
-    <w:p>
-      <w:r>
-        <w:t>1) Сириус</w:t>
-      </w:r>
-    </w:p>
-    <w:p>
-      <w:r>
-        <w:t>2) Капелла</w:t>
-      </w:r>
-    </w:p>
-    <w:p>
-      <w:r>
-        <w:t>3) Арктур</w:t>
-      </w:r>
-    </w:p>
-    <w:p>
-      <w:r>
-        <w:t>4) Фомальгаут</w:t>
+        <w:t>2) Эридан</w:t>
+      </w:r>
+    </w:p>
+    <w:p>
+      <w:r>
+        <w:t>3) Волопас</w:t>
+      </w:r>
+    </w:p>
+    <w:p>
+      <w:r>
+        <w:t>4) Дева</w:t>
+      </w:r>
+    </w:p>
+    <w:p>
+      <w:r>
+        <w:t>3. Какая звезда альфа Больших псов?</w:t>
+      </w:r>
+    </w:p>
+    <w:p>
+      <w:r>
+        <w:t>1) Фомальгаут</w:t>
+      </w:r>
+    </w:p>
+    <w:p>
+      <w:r>
+        <w:t>2) Арктур</w:t>
+      </w:r>
+    </w:p>
+    <w:p>
+      <w:r>
+        <w:t>3) Капелла</w:t>
+      </w:r>
+    </w:p>
+    <w:p>
+      <w:r>
+        <w:t>4) Сириус</w:t>
       </w:r>
     </w:p>
     <w:p>
@@ -154,7 +224,7 @@
         <w:jc w:val="center"/>
       </w:pPr>
       <w:r>
-        <w:t>Sigma</w:t>
+        <w:t>Supertest</w:t>
       </w:r>
     </w:p>
     <w:p>
@@ -167,52 +237,82 @@
     </w:p>
     <w:p>
       <w:r>
-        <w:t>1. Какая звезда альфа Южной рыбы?</w:t>
-      </w:r>
-    </w:p>
-    <w:p>
-      <w:r>
-        <w:t>1) Арктур</w:t>
-      </w:r>
-    </w:p>
-    <w:p>
-      <w:r>
-        <w:t>2) Капелла</w:t>
-      </w:r>
-    </w:p>
-    <w:p>
-      <w:r>
-        <w:t>3) Сириус</w:t>
-      </w:r>
-    </w:p>
-    <w:p>
-      <w:r>
-        <w:t>4) Фомальгаут</w:t>
-      </w:r>
-    </w:p>
-    <w:p>
-      <w:r>
-        <w:t>2. В каком созвездии находится сверхскопление галактик?</w:t>
-      </w:r>
-    </w:p>
-    <w:p>
-      <w:r>
-        <w:t>1) Волопас</w:t>
-      </w:r>
-    </w:p>
-    <w:p>
-      <w:r>
-        <w:t>2) Дева</w:t>
-      </w:r>
-    </w:p>
-    <w:p>
-      <w:r>
-        <w:t>3) Эридан</w:t>
-      </w:r>
-    </w:p>
-    <w:p>
-      <w:r>
-        <w:t>4) Большая медведица</w:t>
+        <w:t>1. Какая звезда альфа Больших псов?</w:t>
+      </w:r>
+    </w:p>
+    <w:p>
+      <w:r>
+        <w:t>1) Фомальгаут</w:t>
+      </w:r>
+    </w:p>
+    <w:p>
+      <w:r>
+        <w:t>2) Сириус</w:t>
+      </w:r>
+    </w:p>
+    <w:p>
+      <w:r>
+        <w:t>3) Арктур</w:t>
+      </w:r>
+    </w:p>
+    <w:p>
+      <w:r>
+        <w:t>4) Капелла</w:t>
+      </w:r>
+    </w:p>
+    <w:p>
+      <w:r>
+        <w:t>2. Какая звезда альфа Волопаса?</w:t>
+      </w:r>
+    </w:p>
+    <w:p>
+      <w:r>
+        <w:t>1) Капелла</w:t>
+      </w:r>
+    </w:p>
+    <w:p>
+      <w:r>
+        <w:t>2) Фомальгаут</w:t>
+      </w:r>
+    </w:p>
+    <w:p>
+      <w:r>
+        <w:t>3) Спика</w:t>
+      </w:r>
+    </w:p>
+    <w:p>
+      <w:r>
+        <w:t>4) Сириус</w:t>
+      </w:r>
+    </w:p>
+    <w:p>
+      <w:r>
+        <w:t>5) Арктур</w:t>
+      </w:r>
+    </w:p>
+    <w:p>
+      <w:r>
+        <w:t>3. В каком созвездии находится сверхскопление галактик?</w:t>
+      </w:r>
+    </w:p>
+    <w:p>
+      <w:r>
+        <w:t>1) Большая медведица</w:t>
+      </w:r>
+    </w:p>
+    <w:p>
+      <w:r>
+        <w:t>2) Волопас</w:t>
+      </w:r>
+    </w:p>
+    <w:p>
+      <w:r>
+        <w:t>3) Дева</w:t>
+      </w:r>
+    </w:p>
+    <w:p>
+      <w:r>
+        <w:t>4) Эридан</w:t>
       </w:r>
     </w:p>
     <w:p>
@@ -225,7 +325,7 @@
         <w:jc w:val="center"/>
       </w:pPr>
       <w:r>
-        <w:t>Sigma</w:t>
+        <w:t>Supertest</w:t>
       </w:r>
     </w:p>
     <w:p>
@@ -238,12 +338,37 @@
     </w:p>
     <w:p>
       <w:r>
-        <w:t>1. В каком созвездии находится сверхскопление галактик?</w:t>
-      </w:r>
-    </w:p>
-    <w:p>
-      <w:r>
-        <w:t>1) Большая медведица</w:t>
+        <w:t>1. Какая звезда альфа Больших псов?</w:t>
+      </w:r>
+    </w:p>
+    <w:p>
+      <w:r>
+        <w:t>1) Сириус</w:t>
+      </w:r>
+    </w:p>
+    <w:p>
+      <w:r>
+        <w:t>2) Капелла</w:t>
+      </w:r>
+    </w:p>
+    <w:p>
+      <w:r>
+        <w:t>3) Арктур</w:t>
+      </w:r>
+    </w:p>
+    <w:p>
+      <w:r>
+        <w:t>4) Фомальгаут</w:t>
+      </w:r>
+    </w:p>
+    <w:p>
+      <w:r>
+        <w:t>2. В каком созвездии находится сверхскопление галактик?</w:t>
+      </w:r>
+    </w:p>
+    <w:p>
+      <w:r>
+        <w:t>1) Дева</w:t>
       </w:r>
     </w:p>
     <w:p>
@@ -253,22 +378,22 @@
     </w:p>
     <w:p>
       <w:r>
-        <w:t>3) Дева</w:t>
-      </w:r>
-    </w:p>
-    <w:p>
-      <w:r>
-        <w:t>4) Эридан</w:t>
-      </w:r>
-    </w:p>
-    <w:p>
-      <w:r>
-        <w:t>2. Какая звезда альфа Южной рыбы?</w:t>
-      </w:r>
-    </w:p>
-    <w:p>
-      <w:r>
-        <w:t>1) Капелла</w:t>
+        <w:t>3) Эридан</w:t>
+      </w:r>
+    </w:p>
+    <w:p>
+      <w:r>
+        <w:t>4) Большая медведица</w:t>
+      </w:r>
+    </w:p>
+    <w:p>
+      <w:r>
+        <w:t>3. Какая звезда альфа Волопаса?</w:t>
+      </w:r>
+    </w:p>
+    <w:p>
+      <w:r>
+        <w:t>1) Сириус</w:t>
       </w:r>
     </w:p>
     <w:p>
@@ -278,12 +403,17 @@
     </w:p>
     <w:p>
       <w:r>
-        <w:t>3) Арктур</w:t>
-      </w:r>
-    </w:p>
-    <w:p>
-      <w:r>
-        <w:t>4) Сириус</w:t>
+        <w:t>3) Спика</w:t>
+      </w:r>
+    </w:p>
+    <w:p>
+      <w:r>
+        <w:t>4) Капелла</w:t>
+      </w:r>
+    </w:p>
+    <w:p>
+      <w:r>
+        <w:t>5) Арктур</w:t>
       </w:r>
     </w:p>
     <w:p>
@@ -296,7 +426,7 @@
         <w:jc w:val="center"/>
       </w:pPr>
       <w:r>
-        <w:t>Sigma</w:t>
+        <w:t>Supertest</w:t>
       </w:r>
     </w:p>
     <w:p>
@@ -309,52 +439,87 @@
     </w:p>
     <w:p>
       <w:r>
-        <w:t>1. Какая звезда альфа Южной рыбы?</w:t>
-      </w:r>
-    </w:p>
-    <w:p>
-      <w:r>
-        <w:t>1) Сириус</w:t>
-      </w:r>
-    </w:p>
-    <w:p>
-      <w:r>
-        <w:t>2) Капелла</w:t>
-      </w:r>
-    </w:p>
-    <w:p>
-      <w:r>
-        <w:t>3) Арктур</w:t>
-      </w:r>
-    </w:p>
-    <w:p>
-      <w:r>
-        <w:t>4) Фомальгаут</w:t>
-      </w:r>
-    </w:p>
-    <w:p>
-      <w:r>
-        <w:t>2. В каком созвездии находится сверхскопление галактик?</w:t>
-      </w:r>
-    </w:p>
-    <w:p>
-      <w:r>
-        <w:t>1) Волопас</w:t>
-      </w:r>
-    </w:p>
-    <w:p>
-      <w:r>
-        <w:t>2) Эридан</w:t>
-      </w:r>
-    </w:p>
-    <w:p>
-      <w:r>
-        <w:t>3) Дева</w:t>
-      </w:r>
-    </w:p>
-    <w:p>
-      <w:r>
-        <w:t>4) Большая медведица</w:t>
+        <w:t>1. В каком созвездии находится сверхскопление галактик?</w:t>
+      </w:r>
+    </w:p>
+    <w:p>
+      <w:r>
+        <w:t>1) Большая медведица</w:t>
+      </w:r>
+    </w:p>
+    <w:p>
+      <w:r>
+        <w:t>2) Дева</w:t>
+      </w:r>
+    </w:p>
+    <w:p>
+      <w:r>
+        <w:t>3) Эридан</w:t>
+      </w:r>
+    </w:p>
+    <w:p>
+      <w:r>
+        <w:t>4) Волопас</w:t>
+      </w:r>
+    </w:p>
+    <w:p>
+      <w:r>
+        <w:t>2. Какой объект находится в каталоге Мессье под номером 45?</w:t>
+      </w:r>
+    </w:p>
+    <w:p>
+      <w:r>
+        <w:t>1) Крабовидная туманность</w:t>
+      </w:r>
+    </w:p>
+    <w:p>
+      <w:r>
+        <w:t>2) Туманность Андромеды</w:t>
+      </w:r>
+    </w:p>
+    <w:p>
+      <w:r>
+        <w:t>3) Плеяды</w:t>
+      </w:r>
+    </w:p>
+    <w:p>
+      <w:r>
+        <w:t>4) Туманность Ориона</w:t>
+      </w:r>
+    </w:p>
+    <w:p>
+      <w:r>
+        <w:t>5) Туманность Кошачий глаз</w:t>
+      </w:r>
+    </w:p>
+    <w:p>
+      <w:r>
+        <w:t>6) Гиады</w:t>
+      </w:r>
+    </w:p>
+    <w:p>
+      <w:r>
+        <w:t>3. Какая звезда альфа Больших псов?</w:t>
+      </w:r>
+    </w:p>
+    <w:p>
+      <w:r>
+        <w:t>1) Арктур</w:t>
+      </w:r>
+    </w:p>
+    <w:p>
+      <w:r>
+        <w:t>2) Фомальгаут</w:t>
+      </w:r>
+    </w:p>
+    <w:p>
+      <w:r>
+        <w:t>3) Сириус</w:t>
+      </w:r>
+    </w:p>
+    <w:p>
+      <w:r>
+        <w:t>4) Капелла</w:t>
       </w:r>
     </w:p>
     <w:p>
@@ -367,7 +532,7 @@
         <w:jc w:val="center"/>
       </w:pPr>
       <w:r>
-        <w:t>Sigma</w:t>
+        <w:t>Supertest</w:t>
       </w:r>
     </w:p>
     <w:p>
@@ -380,17 +545,77 @@
     </w:p>
     <w:p>
       <w:r>
-        <w:t>1. Какая звезда альфа Южной рыбы?</w:t>
-      </w:r>
-    </w:p>
-    <w:p>
-      <w:r>
-        <w:t>1) Фомальгаут</w:t>
-      </w:r>
-    </w:p>
-    <w:p>
-      <w:r>
-        <w:t>2) Арктур</w:t>
+        <w:t>1. Какой объект находится в каталоге Мессье под номером 45?</w:t>
+      </w:r>
+    </w:p>
+    <w:p>
+      <w:r>
+        <w:t>1) Туманность Андромеды</w:t>
+      </w:r>
+    </w:p>
+    <w:p>
+      <w:r>
+        <w:t>2) Туманность Ориона</w:t>
+      </w:r>
+    </w:p>
+    <w:p>
+      <w:r>
+        <w:t>3) Плеяды</w:t>
+      </w:r>
+    </w:p>
+    <w:p>
+      <w:r>
+        <w:t>4) Туманность Кошачий глаз</w:t>
+      </w:r>
+    </w:p>
+    <w:p>
+      <w:r>
+        <w:t>5) Гиады</w:t>
+      </w:r>
+    </w:p>
+    <w:p>
+      <w:r>
+        <w:t>6) Крабовидная туманность</w:t>
+      </w:r>
+    </w:p>
+    <w:p>
+      <w:r>
+        <w:t>2. В каком созвездии находится сверхскопление галактик?</w:t>
+      </w:r>
+    </w:p>
+    <w:p>
+      <w:r>
+        <w:t>1) Волопас</w:t>
+      </w:r>
+    </w:p>
+    <w:p>
+      <w:r>
+        <w:t>2) Большая медведица</w:t>
+      </w:r>
+    </w:p>
+    <w:p>
+      <w:r>
+        <w:t>3) Эридан</w:t>
+      </w:r>
+    </w:p>
+    <w:p>
+      <w:r>
+        <w:t>4) Дева</w:t>
+      </w:r>
+    </w:p>
+    <w:p>
+      <w:r>
+        <w:t>3. Какая звезда альфа Волопаса?</w:t>
+      </w:r>
+    </w:p>
+    <w:p>
+      <w:r>
+        <w:t>1) Капелла</w:t>
+      </w:r>
+    </w:p>
+    <w:p>
+      <w:r>
+        <w:t>2) Фомальгаут</w:t>
       </w:r>
     </w:p>
     <w:p>
@@ -400,37 +625,12 @@
     </w:p>
     <w:p>
       <w:r>
-        <w:t>4) Капелла</w:t>
-      </w:r>
-    </w:p>
-    <w:p>
-      <w:r>
-        <w:t>2. Какая звезда альфа Волопаса?</w:t>
-      </w:r>
-    </w:p>
-    <w:p>
-      <w:r>
-        <w:t>1) Фомальгаут</w:t>
-      </w:r>
-    </w:p>
-    <w:p>
-      <w:r>
-        <w:t>2) Капелла</w:t>
-      </w:r>
-    </w:p>
-    <w:p>
-      <w:r>
-        <w:t>3) Сириус</w:t>
-      </w:r>
-    </w:p>
-    <w:p>
-      <w:r>
-        <w:t>4) Арктур</w:t>
-      </w:r>
-    </w:p>
-    <w:p>
-      <w:r>
-        <w:t>5) Спика</w:t>
+        <w:t>4) Спика</w:t>
+      </w:r>
+    </w:p>
+    <w:p>
+      <w:r>
+        <w:t>5) Арктур</w:t>
       </w:r>
     </w:p>
     <w:p>
@@ -443,7 +643,7 @@
         <w:jc w:val="center"/>
       </w:pPr>
       <w:r>
-        <w:t>Sigma</w:t>
+        <w:t>Supertest</w:t>
       </w:r>
     </w:p>
     <w:p>
@@ -456,12 +656,62 @@
     </w:p>
     <w:p>
       <w:r>
-        <w:t>1. Какая звезда альфа Волопаса?</w:t>
-      </w:r>
-    </w:p>
-    <w:p>
-      <w:r>
-        <w:t>1) Капелла</w:t>
+        <w:t>1. Какая звезда альфа Больших псов?</w:t>
+      </w:r>
+    </w:p>
+    <w:p>
+      <w:r>
+        <w:t>1) Сириус</w:t>
+      </w:r>
+    </w:p>
+    <w:p>
+      <w:r>
+        <w:t>2) Арктур</w:t>
+      </w:r>
+    </w:p>
+    <w:p>
+      <w:r>
+        <w:t>3) Капелла</w:t>
+      </w:r>
+    </w:p>
+    <w:p>
+      <w:r>
+        <w:t>4) Фомальгаут</w:t>
+      </w:r>
+    </w:p>
+    <w:p>
+      <w:r>
+        <w:t>2. В каком созвездии находится сверхскопление галактик?</w:t>
+      </w:r>
+    </w:p>
+    <w:p>
+      <w:r>
+        <w:t>1) Эридан</w:t>
+      </w:r>
+    </w:p>
+    <w:p>
+      <w:r>
+        <w:t>2) Дева</w:t>
+      </w:r>
+    </w:p>
+    <w:p>
+      <w:r>
+        <w:t>3) Волопас</w:t>
+      </w:r>
+    </w:p>
+    <w:p>
+      <w:r>
+        <w:t>4) Большая медведица</w:t>
+      </w:r>
+    </w:p>
+    <w:p>
+      <w:r>
+        <w:t>3. Какая звезда альфа Волопаса?</w:t>
+      </w:r>
+    </w:p>
+    <w:p>
+      <w:r>
+        <w:t>1) Спика</w:t>
       </w:r>
     </w:p>
     <w:p>
@@ -476,37 +726,12 @@
     </w:p>
     <w:p>
       <w:r>
-        <w:t>4) Спика</w:t>
-      </w:r>
-    </w:p>
-    <w:p>
-      <w:r>
-        <w:t>5) Арктур</w:t>
-      </w:r>
-    </w:p>
-    <w:p>
-      <w:r>
-        <w:t>2. В каком созвездии находится сверхскопление галактик?</w:t>
-      </w:r>
-    </w:p>
-    <w:p>
-      <w:r>
-        <w:t>1) Волопас</w:t>
-      </w:r>
-    </w:p>
-    <w:p>
-      <w:r>
-        <w:t>2) Большая медведица</w:t>
-      </w:r>
-    </w:p>
-    <w:p>
-      <w:r>
-        <w:t>3) Эридан</w:t>
-      </w:r>
-    </w:p>
-    <w:p>
-      <w:r>
-        <w:t>4) Дева</w:t>
+        <w:t>4) Арктур</w:t>
+      </w:r>
+    </w:p>
+    <w:p>
+      <w:r>
+        <w:t>5) Капелла</w:t>
       </w:r>
     </w:p>
     <w:p>
@@ -519,7 +744,7 @@
         <w:jc w:val="center"/>
       </w:pPr>
       <w:r>
-        <w:t>Sigma</w:t>
+        <w:t>Supertest</w:t>
       </w:r>
     </w:p>
     <w:p>
@@ -532,7 +757,7 @@
     </w:p>
     <w:p>
       <w:r>
-        <w:t>1. Какая звезда альфа Южной рыбы?</w:t>
+        <w:t>1. Какая звезда альфа Больших псов?</w:t>
       </w:r>
     </w:p>
     <w:p>
@@ -562,22 +787,57 @@
     </w:p>
     <w:p>
       <w:r>
-        <w:t>1) Дева</w:t>
-      </w:r>
-    </w:p>
-    <w:p>
-      <w:r>
-        <w:t>2) Большая медведица</w:t>
-      </w:r>
-    </w:p>
-    <w:p>
-      <w:r>
-        <w:t>3) Волопас</w:t>
-      </w:r>
-    </w:p>
-    <w:p>
-      <w:r>
-        <w:t>4) Эридан</w:t>
+        <w:t>1) Большая медведица</w:t>
+      </w:r>
+    </w:p>
+    <w:p>
+      <w:r>
+        <w:t>2) Волопас</w:t>
+      </w:r>
+    </w:p>
+    <w:p>
+      <w:r>
+        <w:t>3) Эридан</w:t>
+      </w:r>
+    </w:p>
+    <w:p>
+      <w:r>
+        <w:t>4) Дева</w:t>
+      </w:r>
+    </w:p>
+    <w:p>
+      <w:r>
+        <w:t>3. Какой объект находится в каталоге Мессье под номером 45?</w:t>
+      </w:r>
+    </w:p>
+    <w:p>
+      <w:r>
+        <w:t>1) Гиады</w:t>
+      </w:r>
+    </w:p>
+    <w:p>
+      <w:r>
+        <w:t>2) Туманность Андромеды</w:t>
+      </w:r>
+    </w:p>
+    <w:p>
+      <w:r>
+        <w:t>3) Туманность Кошачий глаз</w:t>
+      </w:r>
+    </w:p>
+    <w:p>
+      <w:r>
+        <w:t>4) Крабовидная туманность</w:t>
+      </w:r>
+    </w:p>
+    <w:p>
+      <w:r>
+        <w:t>5) Туманность Ориона</w:t>
+      </w:r>
+    </w:p>
+    <w:p>
+      <w:r>
+        <w:t>6) Плеяды</w:t>
       </w:r>
     </w:p>
     <w:p>
@@ -590,7 +850,7 @@
         <w:jc w:val="center"/>
       </w:pPr>
       <w:r>
-        <w:t>Sigma</w:t>
+        <w:t>Supertest</w:t>
       </w:r>
     </w:p>
     <w:p>
@@ -608,7 +868,7 @@
     </w:p>
     <w:p>
       <w:r>
-        <w:t>1) Дева</w:t>
+        <w:t>1) Волопас</w:t>
       </w:r>
     </w:p>
     <w:p>
@@ -623,32 +883,62 @@
     </w:p>
     <w:p>
       <w:r>
-        <w:t>4) Волопас</w:t>
-      </w:r>
-    </w:p>
-    <w:p>
-      <w:r>
-        <w:t>2. Какая звезда альфа Южной рыбы?</w:t>
-      </w:r>
-    </w:p>
-    <w:p>
-      <w:r>
-        <w:t>1) Сириус</w:t>
-      </w:r>
-    </w:p>
-    <w:p>
-      <w:r>
-        <w:t>2) Капелла</w:t>
-      </w:r>
-    </w:p>
-    <w:p>
-      <w:r>
-        <w:t>3) Фомальгаут</w:t>
-      </w:r>
-    </w:p>
-    <w:p>
-      <w:r>
-        <w:t>4) Арктур</w:t>
+        <w:t>4) Дева</w:t>
+      </w:r>
+    </w:p>
+    <w:p>
+      <w:r>
+        <w:t>2. Какая звезда альфа Волопаса?</w:t>
+      </w:r>
+    </w:p>
+    <w:p>
+      <w:r>
+        <w:t>1) Спика</w:t>
+      </w:r>
+    </w:p>
+    <w:p>
+      <w:r>
+        <w:t>2) Фомальгаут</w:t>
+      </w:r>
+    </w:p>
+    <w:p>
+      <w:r>
+        <w:t>3) Сириус</w:t>
+      </w:r>
+    </w:p>
+    <w:p>
+      <w:r>
+        <w:t>4) Капелла</w:t>
+      </w:r>
+    </w:p>
+    <w:p>
+      <w:r>
+        <w:t>5) Арктур</w:t>
+      </w:r>
+    </w:p>
+    <w:p>
+      <w:r>
+        <w:t>3. Какая звезда альфа Больших псов?</w:t>
+      </w:r>
+    </w:p>
+    <w:p>
+      <w:r>
+        <w:t>1) Фомальгаут</w:t>
+      </w:r>
+    </w:p>
+    <w:p>
+      <w:r>
+        <w:t>2) Сириус</w:t>
+      </w:r>
+    </w:p>
+    <w:p>
+      <w:r>
+        <w:t>3) Арктур</w:t>
+      </w:r>
+    </w:p>
+    <w:p>
+      <w:r>
+        <w:t>4) Капелла</w:t>
       </w:r>
     </w:p>
     <w:p>
@@ -661,7 +951,7 @@
         <w:jc w:val="center"/>
       </w:pPr>
       <w:r>
-        <w:t>Sigma</w:t>
+        <w:t>Supertest</w:t>
       </w:r>
     </w:p>
     <w:p>
@@ -674,7 +964,7 @@
     </w:p>
     <w:p>
       <w:r>
-        <w:t>1. Какая звезда альфа Южной рыбы?</w:t>
+        <w:t>1. Какая звезда альфа Больших псов?</w:t>
       </w:r>
     </w:p>
     <w:p>
@@ -684,12 +974,12 @@
     </w:p>
     <w:p>
       <w:r>
-        <w:t>2) Арктур</w:t>
-      </w:r>
-    </w:p>
-    <w:p>
-      <w:r>
-        <w:t>3) Фомальгаут</w:t>
+        <w:t>2) Фомальгаут</w:t>
+      </w:r>
+    </w:p>
+    <w:p>
+      <w:r>
+        <w:t>3) Арктур</w:t>
       </w:r>
     </w:p>
     <w:p>
@@ -699,32 +989,62 @@
     </w:p>
     <w:p>
       <w:r>
-        <w:t>2. Какая звезда альфа Волопаса?</w:t>
-      </w:r>
-    </w:p>
-    <w:p>
-      <w:r>
-        <w:t>1) Спика</w:t>
-      </w:r>
-    </w:p>
-    <w:p>
-      <w:r>
-        <w:t>2) Фомальгаут</w:t>
-      </w:r>
-    </w:p>
-    <w:p>
-      <w:r>
-        <w:t>3) Капелла</w:t>
-      </w:r>
-    </w:p>
-    <w:p>
-      <w:r>
-        <w:t>4) Сириус</w:t>
-      </w:r>
-    </w:p>
-    <w:p>
-      <w:r>
-        <w:t>5) Арктур</w:t>
+        <w:t>2. Какой объект находится в каталоге Мессье под номером 45?</w:t>
+      </w:r>
+    </w:p>
+    <w:p>
+      <w:r>
+        <w:t>1) Туманность Кошачий глаз</w:t>
+      </w:r>
+    </w:p>
+    <w:p>
+      <w:r>
+        <w:t>2) Крабовидная туманность</w:t>
+      </w:r>
+    </w:p>
+    <w:p>
+      <w:r>
+        <w:t>3) Плеяды</w:t>
+      </w:r>
+    </w:p>
+    <w:p>
+      <w:r>
+        <w:t>4) Туманность Андромеды</w:t>
+      </w:r>
+    </w:p>
+    <w:p>
+      <w:r>
+        <w:t>5) Гиады</w:t>
+      </w:r>
+    </w:p>
+    <w:p>
+      <w:r>
+        <w:t>6) Туманность Ориона</w:t>
+      </w:r>
+    </w:p>
+    <w:p>
+      <w:r>
+        <w:t>3. В каком созвездии находится сверхскопление галактик?</w:t>
+      </w:r>
+    </w:p>
+    <w:p>
+      <w:r>
+        <w:t>1) Волопас</w:t>
+      </w:r>
+    </w:p>
+    <w:p>
+      <w:r>
+        <w:t>2) Дева</w:t>
+      </w:r>
+    </w:p>
+    <w:p>
+      <w:r>
+        <w:t>3) Большая медведица</w:t>
+      </w:r>
+    </w:p>
+    <w:p>
+      <w:r>
+        <w:t>4) Эридан</w:t>
       </w:r>
     </w:p>
     <w:p>
@@ -737,7 +1057,7 @@
         <w:jc w:val="center"/>
       </w:pPr>
       <w:r>
-        <w:t>Sigma</w:t>
+        <w:t>Supertest</w:t>
       </w:r>
     </w:p>
     <w:p>
@@ -750,12 +1070,72 @@
     </w:p>
     <w:p>
       <w:r>
-        <w:t>1. Какая звезда альфа Южной рыбы?</w:t>
-      </w:r>
-    </w:p>
-    <w:p>
-      <w:r>
-        <w:t>1) Сириус</w:t>
+        <w:t>1. Какой объект находится в каталоге Мессье под номером 45?</w:t>
+      </w:r>
+    </w:p>
+    <w:p>
+      <w:r>
+        <w:t>1) Туманность Андромеды</w:t>
+      </w:r>
+    </w:p>
+    <w:p>
+      <w:r>
+        <w:t>2) Плеяды</w:t>
+      </w:r>
+    </w:p>
+    <w:p>
+      <w:r>
+        <w:t>3) Туманность Кошачий глаз</w:t>
+      </w:r>
+    </w:p>
+    <w:p>
+      <w:r>
+        <w:t>4) Крабовидная туманность</w:t>
+      </w:r>
+    </w:p>
+    <w:p>
+      <w:r>
+        <w:t>5) Туманность Ориона</w:t>
+      </w:r>
+    </w:p>
+    <w:p>
+      <w:r>
+        <w:t>6) Гиады</w:t>
+      </w:r>
+    </w:p>
+    <w:p>
+      <w:r>
+        <w:t>2. В каком созвездии находится сверхскопление галактик?</w:t>
+      </w:r>
+    </w:p>
+    <w:p>
+      <w:r>
+        <w:t>1) Большая медведица</w:t>
+      </w:r>
+    </w:p>
+    <w:p>
+      <w:r>
+        <w:t>2) Эридан</w:t>
+      </w:r>
+    </w:p>
+    <w:p>
+      <w:r>
+        <w:t>3) Волопас</w:t>
+      </w:r>
+    </w:p>
+    <w:p>
+      <w:r>
+        <w:t>4) Дева</w:t>
+      </w:r>
+    </w:p>
+    <w:p>
+      <w:r>
+        <w:t>3. Какая звезда альфа Больших псов?</w:t>
+      </w:r>
+    </w:p>
+    <w:p>
+      <w:r>
+        <w:t>1) Арктур</w:t>
       </w:r>
     </w:p>
     <w:p>
@@ -765,42 +1145,12 @@
     </w:p>
     <w:p>
       <w:r>
-        <w:t>3) Арктур</w:t>
-      </w:r>
-    </w:p>
-    <w:p>
-      <w:r>
-        <w:t>4) Фомальгаут</w:t>
-      </w:r>
-    </w:p>
-    <w:p>
-      <w:r>
-        <w:t>2. Какая звезда альфа Волопаса?</w:t>
-      </w:r>
-    </w:p>
-    <w:p>
-      <w:r>
-        <w:t>1) Капелла</w:t>
-      </w:r>
-    </w:p>
-    <w:p>
-      <w:r>
-        <w:t>2) Арктур</w:t>
-      </w:r>
-    </w:p>
-    <w:p>
-      <w:r>
-        <w:t>3) Спика</w:t>
+        <w:t>3) Фомальгаут</w:t>
       </w:r>
     </w:p>
     <w:p>
       <w:r>
         <w:t>4) Сириус</w:t>
-      </w:r>
-    </w:p>
-    <w:p>
-      <w:r>
-        <w:t>5) Фомальгаут</w:t>
       </w:r>
     </w:p>
     <w:p>
@@ -813,7 +1163,7 @@
         <w:jc w:val="center"/>
       </w:pPr>
       <w:r>
-        <w:t>Sigma</w:t>
+        <w:t>Supertest</w:t>
       </w:r>
     </w:p>
     <w:p>
@@ -826,32 +1176,42 @@
     </w:p>
     <w:p>
       <w:r>
-        <w:t>1. В каком созвездии находится сверхскопление галактик?</w:t>
-      </w:r>
-    </w:p>
-    <w:p>
-      <w:r>
-        <w:t>1) Эридан</w:t>
-      </w:r>
-    </w:p>
-    <w:p>
-      <w:r>
-        <w:t>2) Волопас</w:t>
-      </w:r>
-    </w:p>
-    <w:p>
-      <w:r>
-        <w:t>3) Большая медведица</w:t>
-      </w:r>
-    </w:p>
-    <w:p>
-      <w:r>
-        <w:t>4) Дева</w:t>
-      </w:r>
-    </w:p>
-    <w:p>
-      <w:r>
-        <w:t>2. Какая звезда альфа Южной рыбы?</w:t>
+        <w:t>1. Какой объект находится в каталоге Мессье под номером 45?</w:t>
+      </w:r>
+    </w:p>
+    <w:p>
+      <w:r>
+        <w:t>1) Туманность Андромеды</w:t>
+      </w:r>
+    </w:p>
+    <w:p>
+      <w:r>
+        <w:t>2) Плеяды</w:t>
+      </w:r>
+    </w:p>
+    <w:p>
+      <w:r>
+        <w:t>3) Туманность Ориона</w:t>
+      </w:r>
+    </w:p>
+    <w:p>
+      <w:r>
+        <w:t>4) Туманность Кошачий глаз</w:t>
+      </w:r>
+    </w:p>
+    <w:p>
+      <w:r>
+        <w:t>5) Крабовидная туманность</w:t>
+      </w:r>
+    </w:p>
+    <w:p>
+      <w:r>
+        <w:t>6) Гиады</w:t>
+      </w:r>
+    </w:p>
+    <w:p>
+      <w:r>
+        <w:t>2. Какая звезда альфа Больших псов?</w:t>
       </w:r>
     </w:p>
     <w:p>
@@ -861,7 +1221,32 @@
     </w:p>
     <w:p>
       <w:r>
-        <w:t>2) Арктур</w:t>
+        <w:t>2) Сириус</w:t>
+      </w:r>
+    </w:p>
+    <w:p>
+      <w:r>
+        <w:t>3) Арктур</w:t>
+      </w:r>
+    </w:p>
+    <w:p>
+      <w:r>
+        <w:t>4) Фомальгаут</w:t>
+      </w:r>
+    </w:p>
+    <w:p>
+      <w:r>
+        <w:t>3. Какая звезда альфа Волопаса?</w:t>
+      </w:r>
+    </w:p>
+    <w:p>
+      <w:r>
+        <w:t>1) Капелла</w:t>
+      </w:r>
+    </w:p>
+    <w:p>
+      <w:r>
+        <w:t>2) Спика</w:t>
       </w:r>
     </w:p>
     <w:p>
@@ -872,6 +1257,11 @@
     <w:p>
       <w:r>
         <w:t>4) Фомальгаут</w:t>
+      </w:r>
+    </w:p>
+    <w:p>
+      <w:r>
+        <w:t>5) Арктур</w:t>
       </w:r>
     </w:p>
     <w:p>
@@ -884,7 +1274,7 @@
         <w:jc w:val="center"/>
       </w:pPr>
       <w:r>
-        <w:t>Sigma</w:t>
+        <w:t>Supertest</w:t>
       </w:r>
     </w:p>
     <w:p>
@@ -902,22 +1292,22 @@
     </w:p>
     <w:p>
       <w:r>
-        <w:t>1) Волопас</w:t>
-      </w:r>
-    </w:p>
-    <w:p>
-      <w:r>
-        <w:t>2) Эридан</w:t>
-      </w:r>
-    </w:p>
-    <w:p>
-      <w:r>
-        <w:t>3) Большая медведица</w:t>
-      </w:r>
-    </w:p>
-    <w:p>
-      <w:r>
-        <w:t>4) Дева</w:t>
+        <w:t>1) Эридан</w:t>
+      </w:r>
+    </w:p>
+    <w:p>
+      <w:r>
+        <w:t>2) Дева</w:t>
+      </w:r>
+    </w:p>
+    <w:p>
+      <w:r>
+        <w:t>3) Волопас</w:t>
+      </w:r>
+    </w:p>
+    <w:p>
+      <w:r>
+        <w:t>4) Большая медведица</w:t>
       </w:r>
     </w:p>
     <w:p>
@@ -932,12 +1322,12 @@
     </w:p>
     <w:p>
       <w:r>
-        <w:t>2) Сириус</w:t>
-      </w:r>
-    </w:p>
-    <w:p>
-      <w:r>
-        <w:t>3) Фомальгаут</w:t>
+        <w:t>2) Фомальгаут</w:t>
+      </w:r>
+    </w:p>
+    <w:p>
+      <w:r>
+        <w:t>3) Спика</w:t>
       </w:r>
     </w:p>
     <w:p>
@@ -947,7 +1337,42 @@
     </w:p>
     <w:p>
       <w:r>
-        <w:t>5) Спика</w:t>
+        <w:t>5) Сириус</w:t>
+      </w:r>
+    </w:p>
+    <w:p>
+      <w:r>
+        <w:t>3. Какой объект находится в каталоге Мессье под номером 45?</w:t>
+      </w:r>
+    </w:p>
+    <w:p>
+      <w:r>
+        <w:t>1) Туманность Ориона</w:t>
+      </w:r>
+    </w:p>
+    <w:p>
+      <w:r>
+        <w:t>2) Гиады</w:t>
+      </w:r>
+    </w:p>
+    <w:p>
+      <w:r>
+        <w:t>3) Крабовидная туманность</w:t>
+      </w:r>
+    </w:p>
+    <w:p>
+      <w:r>
+        <w:t>4) Туманность Андромеды</w:t>
+      </w:r>
+    </w:p>
+    <w:p>
+      <w:r>
+        <w:t>5) Туманность Кошачий глаз</w:t>
+      </w:r>
+    </w:p>
+    <w:p>
+      <w:r>
+        <w:t>6) Плеяды</w:t>
       </w:r>
     </w:p>
     <w:p>
@@ -960,7 +1385,7 @@
         <w:jc w:val="center"/>
       </w:pPr>
       <w:r>
-        <w:t>Sigma</w:t>
+        <w:t>Supertest</w:t>
       </w:r>
     </w:p>
     <w:p>
@@ -973,32 +1398,7 @@
     </w:p>
     <w:p>
       <w:r>
-        <w:t>1. В каком созвездии находится сверхскопление галактик?</w:t>
-      </w:r>
-    </w:p>
-    <w:p>
-      <w:r>
-        <w:t>1) Волопас</w:t>
-      </w:r>
-    </w:p>
-    <w:p>
-      <w:r>
-        <w:t>2) Эридан</w:t>
-      </w:r>
-    </w:p>
-    <w:p>
-      <w:r>
-        <w:t>3) Большая медведица</w:t>
-      </w:r>
-    </w:p>
-    <w:p>
-      <w:r>
-        <w:t>4) Дева</w:t>
-      </w:r>
-    </w:p>
-    <w:p>
-      <w:r>
-        <w:t>2. Какая звезда альфа Южной рыбы?</w:t>
+        <w:t>1. Какая звезда альфа Больших псов?</w:t>
       </w:r>
     </w:p>
     <w:p>
@@ -1008,7 +1408,7 @@
     </w:p>
     <w:p>
       <w:r>
-        <w:t>2) Капелла</w:t>
+        <w:t>2) Сириус</w:t>
       </w:r>
     </w:p>
     <w:p>
@@ -1018,7 +1418,72 @@
     </w:p>
     <w:p>
       <w:r>
-        <w:t>4) Сириус</w:t>
+        <w:t>4) Капелла</w:t>
+      </w:r>
+    </w:p>
+    <w:p>
+      <w:r>
+        <w:t>2. Какой объект находится в каталоге Мессье под номером 45?</w:t>
+      </w:r>
+    </w:p>
+    <w:p>
+      <w:r>
+        <w:t>1) Крабовидная туманность</w:t>
+      </w:r>
+    </w:p>
+    <w:p>
+      <w:r>
+        <w:t>2) Туманность Андромеды</w:t>
+      </w:r>
+    </w:p>
+    <w:p>
+      <w:r>
+        <w:t>3) Плеяды</w:t>
+      </w:r>
+    </w:p>
+    <w:p>
+      <w:r>
+        <w:t>4) Туманность Кошачий глаз</w:t>
+      </w:r>
+    </w:p>
+    <w:p>
+      <w:r>
+        <w:t>5) Гиады</w:t>
+      </w:r>
+    </w:p>
+    <w:p>
+      <w:r>
+        <w:t>6) Туманность Ориона</w:t>
+      </w:r>
+    </w:p>
+    <w:p>
+      <w:r>
+        <w:t>3. Какая звезда альфа Волопаса?</w:t>
+      </w:r>
+    </w:p>
+    <w:p>
+      <w:r>
+        <w:t>1) Арктур</w:t>
+      </w:r>
+    </w:p>
+    <w:p>
+      <w:r>
+        <w:t>2) Сириус</w:t>
+      </w:r>
+    </w:p>
+    <w:p>
+      <w:r>
+        <w:t>3) Фомальгаут</w:t>
+      </w:r>
+    </w:p>
+    <w:p>
+      <w:r>
+        <w:t>4) Спика</w:t>
+      </w:r>
+    </w:p>
+    <w:p>
+      <w:r>
+        <w:t>5) Капелла</w:t>
       </w:r>
     </w:p>
     <w:p>
@@ -1031,7 +1496,7 @@
         <w:jc w:val="center"/>
       </w:pPr>
       <w:r>
-        <w:t>Sigma</w:t>
+        <w:t>Supertest</w:t>
       </w:r>
     </w:p>
     <w:p>
@@ -1044,32 +1509,1521 @@
     </w:p>
     <w:p>
       <w:r>
+        <w:t>1. Какая звезда альфа Волопаса?</w:t>
+      </w:r>
+    </w:p>
+    <w:p>
+      <w:r>
+        <w:t>1) Спика</w:t>
+      </w:r>
+    </w:p>
+    <w:p>
+      <w:r>
+        <w:t>2) Арктур</w:t>
+      </w:r>
+    </w:p>
+    <w:p>
+      <w:r>
+        <w:t>3) Сириус</w:t>
+      </w:r>
+    </w:p>
+    <w:p>
+      <w:r>
+        <w:t>4) Фомальгаут</w:t>
+      </w:r>
+    </w:p>
+    <w:p>
+      <w:r>
+        <w:t>5) Капелла</w:t>
+      </w:r>
+    </w:p>
+    <w:p>
+      <w:r>
+        <w:t>2. Какая звезда альфа Больших псов?</w:t>
+      </w:r>
+    </w:p>
+    <w:p>
+      <w:r>
+        <w:t>1) Капелла</w:t>
+      </w:r>
+    </w:p>
+    <w:p>
+      <w:r>
+        <w:t>2) Арктур</w:t>
+      </w:r>
+    </w:p>
+    <w:p>
+      <w:r>
+        <w:t>3) Сириус</w:t>
+      </w:r>
+    </w:p>
+    <w:p>
+      <w:r>
+        <w:t>4) Фомальгаут</w:t>
+      </w:r>
+    </w:p>
+    <w:p>
+      <w:r>
+        <w:t>3. Какой объект находится в каталоге Мессье под номером 45?</w:t>
+      </w:r>
+    </w:p>
+    <w:p>
+      <w:r>
+        <w:t>1) Туманность Кошачий глаз</w:t>
+      </w:r>
+    </w:p>
+    <w:p>
+      <w:r>
+        <w:t>2) Гиады</w:t>
+      </w:r>
+    </w:p>
+    <w:p>
+      <w:r>
+        <w:t>3) Крабовидная туманность</w:t>
+      </w:r>
+    </w:p>
+    <w:p>
+      <w:r>
+        <w:t>4) Туманность Андромеды</w:t>
+      </w:r>
+    </w:p>
+    <w:p>
+      <w:r>
+        <w:t>5) Туманность Ориона</w:t>
+      </w:r>
+    </w:p>
+    <w:p>
+      <w:r>
+        <w:t>6) Плеяды</w:t>
+      </w:r>
+    </w:p>
+    <w:p>
+      <w:r>
+        <w:br w:type="page"/>
+      </w:r>
+    </w:p>
+    <w:p>
+      <w:pPr>
+        <w:jc w:val="center"/>
+      </w:pPr>
+      <w:r>
+        <w:t>Supertest</w:t>
+      </w:r>
+    </w:p>
+    <w:p>
+      <w:pPr>
+        <w:jc w:val="center"/>
+      </w:pPr>
+      <w:r>
+        <w:t>Вариант 16</w:t>
+      </w:r>
+    </w:p>
+    <w:p>
+      <w:r>
+        <w:t>1. Какой объект находится в каталоге Мессье под номером 45?</w:t>
+      </w:r>
+    </w:p>
+    <w:p>
+      <w:r>
+        <w:t>1) Туманность Ориона</w:t>
+      </w:r>
+    </w:p>
+    <w:p>
+      <w:r>
+        <w:t>2) Туманность Кошачий глаз</w:t>
+      </w:r>
+    </w:p>
+    <w:p>
+      <w:r>
+        <w:t>3) Туманность Андромеды</w:t>
+      </w:r>
+    </w:p>
+    <w:p>
+      <w:r>
+        <w:t>4) Плеяды</w:t>
+      </w:r>
+    </w:p>
+    <w:p>
+      <w:r>
+        <w:t>5) Гиады</w:t>
+      </w:r>
+    </w:p>
+    <w:p>
+      <w:r>
+        <w:t>6) Крабовидная туманность</w:t>
+      </w:r>
+    </w:p>
+    <w:p>
+      <w:r>
+        <w:t>2. В каком созвездии находится сверхскопление галактик?</w:t>
+      </w:r>
+    </w:p>
+    <w:p>
+      <w:r>
+        <w:t>1) Эридан</w:t>
+      </w:r>
+    </w:p>
+    <w:p>
+      <w:r>
+        <w:t>2) Дева</w:t>
+      </w:r>
+    </w:p>
+    <w:p>
+      <w:r>
+        <w:t>3) Большая медведица</w:t>
+      </w:r>
+    </w:p>
+    <w:p>
+      <w:r>
+        <w:t>4) Волопас</w:t>
+      </w:r>
+    </w:p>
+    <w:p>
+      <w:r>
+        <w:t>3. Какая звезда альфа Больших псов?</w:t>
+      </w:r>
+    </w:p>
+    <w:p>
+      <w:r>
+        <w:t>1) Арктур</w:t>
+      </w:r>
+    </w:p>
+    <w:p>
+      <w:r>
+        <w:t>2) Капелла</w:t>
+      </w:r>
+    </w:p>
+    <w:p>
+      <w:r>
+        <w:t>3) Фомальгаут</w:t>
+      </w:r>
+    </w:p>
+    <w:p>
+      <w:r>
+        <w:t>4) Сириус</w:t>
+      </w:r>
+    </w:p>
+    <w:p>
+      <w:r>
+        <w:br w:type="page"/>
+      </w:r>
+    </w:p>
+    <w:p>
+      <w:pPr>
+        <w:jc w:val="center"/>
+      </w:pPr>
+      <w:r>
+        <w:t>Supertest</w:t>
+      </w:r>
+    </w:p>
+    <w:p>
+      <w:pPr>
+        <w:jc w:val="center"/>
+      </w:pPr>
+      <w:r>
+        <w:t>Вариант 17</w:t>
+      </w:r>
+    </w:p>
+    <w:p>
+      <w:r>
+        <w:t>1. Какая звезда альфа Больших псов?</w:t>
+      </w:r>
+    </w:p>
+    <w:p>
+      <w:r>
+        <w:t>1) Сириус</w:t>
+      </w:r>
+    </w:p>
+    <w:p>
+      <w:r>
+        <w:t>2) Фомальгаут</w:t>
+      </w:r>
+    </w:p>
+    <w:p>
+      <w:r>
+        <w:t>3) Капелла</w:t>
+      </w:r>
+    </w:p>
+    <w:p>
+      <w:r>
+        <w:t>4) Арктур</w:t>
+      </w:r>
+    </w:p>
+    <w:p>
+      <w:r>
+        <w:t>2. Какой объект находится в каталоге Мессье под номером 45?</w:t>
+      </w:r>
+    </w:p>
+    <w:p>
+      <w:r>
+        <w:t>1) Туманность Ориона</w:t>
+      </w:r>
+    </w:p>
+    <w:p>
+      <w:r>
+        <w:t>2) Туманность Андромеды</w:t>
+      </w:r>
+    </w:p>
+    <w:p>
+      <w:r>
+        <w:t>3) Туманность Кошачий глаз</w:t>
+      </w:r>
+    </w:p>
+    <w:p>
+      <w:r>
+        <w:t>4) Крабовидная туманность</w:t>
+      </w:r>
+    </w:p>
+    <w:p>
+      <w:r>
+        <w:t>5) Плеяды</w:t>
+      </w:r>
+    </w:p>
+    <w:p>
+      <w:r>
+        <w:t>6) Гиады</w:t>
+      </w:r>
+    </w:p>
+    <w:p>
+      <w:r>
+        <w:t>3. В каком созвездии находится сверхскопление галактик?</w:t>
+      </w:r>
+    </w:p>
+    <w:p>
+      <w:r>
+        <w:t>1) Эридан</w:t>
+      </w:r>
+    </w:p>
+    <w:p>
+      <w:r>
+        <w:t>2) Волопас</w:t>
+      </w:r>
+    </w:p>
+    <w:p>
+      <w:r>
+        <w:t>3) Большая медведица</w:t>
+      </w:r>
+    </w:p>
+    <w:p>
+      <w:r>
+        <w:t>4) Дева</w:t>
+      </w:r>
+    </w:p>
+    <w:p>
+      <w:r>
+        <w:br w:type="page"/>
+      </w:r>
+    </w:p>
+    <w:p>
+      <w:pPr>
+        <w:jc w:val="center"/>
+      </w:pPr>
+      <w:r>
+        <w:t>Supertest</w:t>
+      </w:r>
+    </w:p>
+    <w:p>
+      <w:pPr>
+        <w:jc w:val="center"/>
+      </w:pPr>
+      <w:r>
+        <w:t>Вариант 18</w:t>
+      </w:r>
+    </w:p>
+    <w:p>
+      <w:r>
         <w:t>1. В каком созвездии находится сверхскопление галактик?</w:t>
       </w:r>
     </w:p>
     <w:p>
       <w:r>
+        <w:t>1) Большая медведица</w:t>
+      </w:r>
+    </w:p>
+    <w:p>
+      <w:r>
+        <w:t>2) Волопас</w:t>
+      </w:r>
+    </w:p>
+    <w:p>
+      <w:r>
+        <w:t>3) Эридан</w:t>
+      </w:r>
+    </w:p>
+    <w:p>
+      <w:r>
+        <w:t>4) Дева</w:t>
+      </w:r>
+    </w:p>
+    <w:p>
+      <w:r>
+        <w:t>2. Какой объект находится в каталоге Мессье под номером 45?</w:t>
+      </w:r>
+    </w:p>
+    <w:p>
+      <w:r>
+        <w:t>1) Крабовидная туманность</w:t>
+      </w:r>
+    </w:p>
+    <w:p>
+      <w:r>
+        <w:t>2) Гиады</w:t>
+      </w:r>
+    </w:p>
+    <w:p>
+      <w:r>
+        <w:t>3) Туманность Андромеды</w:t>
+      </w:r>
+    </w:p>
+    <w:p>
+      <w:r>
+        <w:t>4) Туманность Кошачий глаз</w:t>
+      </w:r>
+    </w:p>
+    <w:p>
+      <w:r>
+        <w:t>5) Туманность Ориона</w:t>
+      </w:r>
+    </w:p>
+    <w:p>
+      <w:r>
+        <w:t>6) Плеяды</w:t>
+      </w:r>
+    </w:p>
+    <w:p>
+      <w:r>
+        <w:t>3. Какая звезда альфа Больших псов?</w:t>
+      </w:r>
+    </w:p>
+    <w:p>
+      <w:r>
+        <w:t>1) Сириус</w:t>
+      </w:r>
+    </w:p>
+    <w:p>
+      <w:r>
+        <w:t>2) Капелла</w:t>
+      </w:r>
+    </w:p>
+    <w:p>
+      <w:r>
+        <w:t>3) Фомальгаут</w:t>
+      </w:r>
+    </w:p>
+    <w:p>
+      <w:r>
+        <w:t>4) Арктур</w:t>
+      </w:r>
+    </w:p>
+    <w:p>
+      <w:r>
+        <w:br w:type="page"/>
+      </w:r>
+    </w:p>
+    <w:p>
+      <w:pPr>
+        <w:jc w:val="center"/>
+      </w:pPr>
+      <w:r>
+        <w:t>Supertest</w:t>
+      </w:r>
+    </w:p>
+    <w:p>
+      <w:pPr>
+        <w:jc w:val="center"/>
+      </w:pPr>
+      <w:r>
+        <w:t>Вариант 19</w:t>
+      </w:r>
+    </w:p>
+    <w:p>
+      <w:r>
+        <w:t>1. Какой объект находится в каталоге Мессье под номером 45?</w:t>
+      </w:r>
+    </w:p>
+    <w:p>
+      <w:r>
+        <w:t>1) Гиады</w:t>
+      </w:r>
+    </w:p>
+    <w:p>
+      <w:r>
+        <w:t>2) Туманность Ориона</w:t>
+      </w:r>
+    </w:p>
+    <w:p>
+      <w:r>
+        <w:t>3) Крабовидная туманность</w:t>
+      </w:r>
+    </w:p>
+    <w:p>
+      <w:r>
+        <w:t>4) Туманность Кошачий глаз</w:t>
+      </w:r>
+    </w:p>
+    <w:p>
+      <w:r>
+        <w:t>5) Плеяды</w:t>
+      </w:r>
+    </w:p>
+    <w:p>
+      <w:r>
+        <w:t>6) Туманность Андромеды</w:t>
+      </w:r>
+    </w:p>
+    <w:p>
+      <w:r>
+        <w:t>2. Какая звезда альфа Волопаса?</w:t>
+      </w:r>
+    </w:p>
+    <w:p>
+      <w:r>
+        <w:t>1) Фомальгаут</w:t>
+      </w:r>
+    </w:p>
+    <w:p>
+      <w:r>
+        <w:t>2) Сириус</w:t>
+      </w:r>
+    </w:p>
+    <w:p>
+      <w:r>
+        <w:t>3) Арктур</w:t>
+      </w:r>
+    </w:p>
+    <w:p>
+      <w:r>
+        <w:t>4) Капелла</w:t>
+      </w:r>
+    </w:p>
+    <w:p>
+      <w:r>
+        <w:t>5) Спика</w:t>
+      </w:r>
+    </w:p>
+    <w:p>
+      <w:r>
+        <w:t>3. Какая звезда альфа Больших псов?</w:t>
+      </w:r>
+    </w:p>
+    <w:p>
+      <w:r>
+        <w:t>1) Арктур</w:t>
+      </w:r>
+    </w:p>
+    <w:p>
+      <w:r>
+        <w:t>2) Сириус</w:t>
+      </w:r>
+    </w:p>
+    <w:p>
+      <w:r>
+        <w:t>3) Капелла</w:t>
+      </w:r>
+    </w:p>
+    <w:p>
+      <w:r>
+        <w:t>4) Фомальгаут</w:t>
+      </w:r>
+    </w:p>
+    <w:p>
+      <w:r>
+        <w:br w:type="page"/>
+      </w:r>
+    </w:p>
+    <w:p>
+      <w:pPr>
+        <w:jc w:val="center"/>
+      </w:pPr>
+      <w:r>
+        <w:t>Supertest</w:t>
+      </w:r>
+    </w:p>
+    <w:p>
+      <w:pPr>
+        <w:jc w:val="center"/>
+      </w:pPr>
+      <w:r>
+        <w:t>Вариант 20</w:t>
+      </w:r>
+    </w:p>
+    <w:p>
+      <w:r>
+        <w:t>1. Какая звезда альфа Волопаса?</w:t>
+      </w:r>
+    </w:p>
+    <w:p>
+      <w:r>
+        <w:t>1) Арктур</w:t>
+      </w:r>
+    </w:p>
+    <w:p>
+      <w:r>
+        <w:t>2) Капелла</w:t>
+      </w:r>
+    </w:p>
+    <w:p>
+      <w:r>
+        <w:t>3) Фомальгаут</w:t>
+      </w:r>
+    </w:p>
+    <w:p>
+      <w:r>
+        <w:t>4) Сириус</w:t>
+      </w:r>
+    </w:p>
+    <w:p>
+      <w:r>
+        <w:t>5) Спика</w:t>
+      </w:r>
+    </w:p>
+    <w:p>
+      <w:r>
+        <w:t>2. В каком созвездии находится сверхскопление галактик?</w:t>
+      </w:r>
+    </w:p>
+    <w:p>
+      <w:r>
         <w:t>1) Волопас</w:t>
       </w:r>
     </w:p>
     <w:p>
       <w:r>
+        <w:t>2) Эридан</w:t>
+      </w:r>
+    </w:p>
+    <w:p>
+      <w:r>
+        <w:t>3) Большая медведица</w:t>
+      </w:r>
+    </w:p>
+    <w:p>
+      <w:r>
+        <w:t>4) Дева</w:t>
+      </w:r>
+    </w:p>
+    <w:p>
+      <w:r>
+        <w:t>3. Какой объект находится в каталоге Мессье под номером 45?</w:t>
+      </w:r>
+    </w:p>
+    <w:p>
+      <w:r>
+        <w:t>1) Туманность Андромеды</w:t>
+      </w:r>
+    </w:p>
+    <w:p>
+      <w:r>
+        <w:t>2) Туманность Кошачий глаз</w:t>
+      </w:r>
+    </w:p>
+    <w:p>
+      <w:r>
+        <w:t>3) Туманность Ориона</w:t>
+      </w:r>
+    </w:p>
+    <w:p>
+      <w:r>
+        <w:t>4) Плеяды</w:t>
+      </w:r>
+    </w:p>
+    <w:p>
+      <w:r>
+        <w:t>5) Гиады</w:t>
+      </w:r>
+    </w:p>
+    <w:p>
+      <w:r>
+        <w:t>6) Крабовидная туманность</w:t>
+      </w:r>
+    </w:p>
+    <w:p>
+      <w:r>
+        <w:br w:type="page"/>
+      </w:r>
+    </w:p>
+    <w:p>
+      <w:pPr>
+        <w:jc w:val="center"/>
+      </w:pPr>
+      <w:r>
+        <w:t>Supertest</w:t>
+      </w:r>
+    </w:p>
+    <w:p>
+      <w:pPr>
+        <w:jc w:val="center"/>
+      </w:pPr>
+      <w:r>
+        <w:t>Вариант 21</w:t>
+      </w:r>
+    </w:p>
+    <w:p>
+      <w:r>
+        <w:t>1. В каком созвездии находится сверхскопление галактик?</w:t>
+      </w:r>
+    </w:p>
+    <w:p>
+      <w:r>
+        <w:t>1) Эридан</w:t>
+      </w:r>
+    </w:p>
+    <w:p>
+      <w:r>
+        <w:t>2) Большая медведица</w:t>
+      </w:r>
+    </w:p>
+    <w:p>
+      <w:r>
+        <w:t>3) Волопас</w:t>
+      </w:r>
+    </w:p>
+    <w:p>
+      <w:r>
+        <w:t>4) Дева</w:t>
+      </w:r>
+    </w:p>
+    <w:p>
+      <w:r>
+        <w:t>2. Какой объект находится в каталоге Мессье под номером 45?</w:t>
+      </w:r>
+    </w:p>
+    <w:p>
+      <w:r>
+        <w:t>1) Туманность Андромеды</w:t>
+      </w:r>
+    </w:p>
+    <w:p>
+      <w:r>
+        <w:t>2) Плеяды</w:t>
+      </w:r>
+    </w:p>
+    <w:p>
+      <w:r>
+        <w:t>3) Крабовидная туманность</w:t>
+      </w:r>
+    </w:p>
+    <w:p>
+      <w:r>
+        <w:t>4) Туманность Ориона</w:t>
+      </w:r>
+    </w:p>
+    <w:p>
+      <w:r>
+        <w:t>5) Гиады</w:t>
+      </w:r>
+    </w:p>
+    <w:p>
+      <w:r>
+        <w:t>6) Туманность Кошачий глаз</w:t>
+      </w:r>
+    </w:p>
+    <w:p>
+      <w:r>
+        <w:t>3. Какая звезда альфа Больших псов?</w:t>
+      </w:r>
+    </w:p>
+    <w:p>
+      <w:r>
+        <w:t>1) Сириус</w:t>
+      </w:r>
+    </w:p>
+    <w:p>
+      <w:r>
+        <w:t>2) Капелла</w:t>
+      </w:r>
+    </w:p>
+    <w:p>
+      <w:r>
+        <w:t>3) Арктур</w:t>
+      </w:r>
+    </w:p>
+    <w:p>
+      <w:r>
+        <w:t>4) Фомальгаут</w:t>
+      </w:r>
+    </w:p>
+    <w:p>
+      <w:r>
+        <w:br w:type="page"/>
+      </w:r>
+    </w:p>
+    <w:p>
+      <w:pPr>
+        <w:jc w:val="center"/>
+      </w:pPr>
+      <w:r>
+        <w:t>Supertest</w:t>
+      </w:r>
+    </w:p>
+    <w:p>
+      <w:pPr>
+        <w:jc w:val="center"/>
+      </w:pPr>
+      <w:r>
+        <w:t>Вариант 22</w:t>
+      </w:r>
+    </w:p>
+    <w:p>
+      <w:r>
+        <w:t>1. Какая звезда альфа Волопаса?</w:t>
+      </w:r>
+    </w:p>
+    <w:p>
+      <w:r>
+        <w:t>1) Спика</w:t>
+      </w:r>
+    </w:p>
+    <w:p>
+      <w:r>
+        <w:t>2) Арктур</w:t>
+      </w:r>
+    </w:p>
+    <w:p>
+      <w:r>
+        <w:t>3) Капелла</w:t>
+      </w:r>
+    </w:p>
+    <w:p>
+      <w:r>
+        <w:t>4) Сириус</w:t>
+      </w:r>
+    </w:p>
+    <w:p>
+      <w:r>
+        <w:t>5) Фомальгаут</w:t>
+      </w:r>
+    </w:p>
+    <w:p>
+      <w:r>
+        <w:t>2. Какой объект находится в каталоге Мессье под номером 45?</w:t>
+      </w:r>
+    </w:p>
+    <w:p>
+      <w:r>
+        <w:t>1) Гиады</w:t>
+      </w:r>
+    </w:p>
+    <w:p>
+      <w:r>
+        <w:t>2) Плеяды</w:t>
+      </w:r>
+    </w:p>
+    <w:p>
+      <w:r>
+        <w:t>3) Туманность Ориона</w:t>
+      </w:r>
+    </w:p>
+    <w:p>
+      <w:r>
+        <w:t>4) Крабовидная туманность</w:t>
+      </w:r>
+    </w:p>
+    <w:p>
+      <w:r>
+        <w:t>5) Туманность Кошачий глаз</w:t>
+      </w:r>
+    </w:p>
+    <w:p>
+      <w:r>
+        <w:t>6) Туманность Андромеды</w:t>
+      </w:r>
+    </w:p>
+    <w:p>
+      <w:r>
+        <w:t>3. Какая звезда альфа Больших псов?</w:t>
+      </w:r>
+    </w:p>
+    <w:p>
+      <w:r>
+        <w:t>1) Арктур</w:t>
+      </w:r>
+    </w:p>
+    <w:p>
+      <w:r>
+        <w:t>2) Фомальгаут</w:t>
+      </w:r>
+    </w:p>
+    <w:p>
+      <w:r>
+        <w:t>3) Капелла</w:t>
+      </w:r>
+    </w:p>
+    <w:p>
+      <w:r>
+        <w:t>4) Сириус</w:t>
+      </w:r>
+    </w:p>
+    <w:p>
+      <w:r>
+        <w:br w:type="page"/>
+      </w:r>
+    </w:p>
+    <w:p>
+      <w:pPr>
+        <w:jc w:val="center"/>
+      </w:pPr>
+      <w:r>
+        <w:t>Supertest</w:t>
+      </w:r>
+    </w:p>
+    <w:p>
+      <w:pPr>
+        <w:jc w:val="center"/>
+      </w:pPr>
+      <w:r>
+        <w:t>Вариант 23</w:t>
+      </w:r>
+    </w:p>
+    <w:p>
+      <w:r>
+        <w:t>1. В каком созвездии находится сверхскопление галактик?</w:t>
+      </w:r>
+    </w:p>
+    <w:p>
+      <w:r>
+        <w:t>1) Эридан</w:t>
+      </w:r>
+    </w:p>
+    <w:p>
+      <w:r>
+        <w:t>2) Большая медведица</w:t>
+      </w:r>
+    </w:p>
+    <w:p>
+      <w:r>
+        <w:t>3) Дева</w:t>
+      </w:r>
+    </w:p>
+    <w:p>
+      <w:r>
+        <w:t>4) Волопас</w:t>
+      </w:r>
+    </w:p>
+    <w:p>
+      <w:r>
+        <w:t>2. Какая звезда альфа Больших псов?</w:t>
+      </w:r>
+    </w:p>
+    <w:p>
+      <w:r>
+        <w:t>1) Сириус</w:t>
+      </w:r>
+    </w:p>
+    <w:p>
+      <w:r>
+        <w:t>2) Фомальгаут</w:t>
+      </w:r>
+    </w:p>
+    <w:p>
+      <w:r>
+        <w:t>3) Капелла</w:t>
+      </w:r>
+    </w:p>
+    <w:p>
+      <w:r>
+        <w:t>4) Арктур</w:t>
+      </w:r>
+    </w:p>
+    <w:p>
+      <w:r>
+        <w:t>3. Какой объект находится в каталоге Мессье под номером 45?</w:t>
+      </w:r>
+    </w:p>
+    <w:p>
+      <w:r>
+        <w:t>1) Туманность Кошачий глаз</w:t>
+      </w:r>
+    </w:p>
+    <w:p>
+      <w:r>
+        <w:t>2) Крабовидная туманность</w:t>
+      </w:r>
+    </w:p>
+    <w:p>
+      <w:r>
+        <w:t>3) Туманность Ориона</w:t>
+      </w:r>
+    </w:p>
+    <w:p>
+      <w:r>
+        <w:t>4) Плеяды</w:t>
+      </w:r>
+    </w:p>
+    <w:p>
+      <w:r>
+        <w:t>5) Туманность Андромеды</w:t>
+      </w:r>
+    </w:p>
+    <w:p>
+      <w:r>
+        <w:t>6) Гиады</w:t>
+      </w:r>
+    </w:p>
+    <w:p>
+      <w:r>
+        <w:br w:type="page"/>
+      </w:r>
+    </w:p>
+    <w:p>
+      <w:pPr>
+        <w:jc w:val="center"/>
+      </w:pPr>
+      <w:r>
+        <w:t>Supertest</w:t>
+      </w:r>
+    </w:p>
+    <w:p>
+      <w:pPr>
+        <w:jc w:val="center"/>
+      </w:pPr>
+      <w:r>
+        <w:t>Вариант 24</w:t>
+      </w:r>
+    </w:p>
+    <w:p>
+      <w:r>
+        <w:t>1. Какая звезда альфа Волопаса?</w:t>
+      </w:r>
+    </w:p>
+    <w:p>
+      <w:r>
+        <w:t>1) Капелла</w:t>
+      </w:r>
+    </w:p>
+    <w:p>
+      <w:r>
+        <w:t>2) Спика</w:t>
+      </w:r>
+    </w:p>
+    <w:p>
+      <w:r>
+        <w:t>3) Арктур</w:t>
+      </w:r>
+    </w:p>
+    <w:p>
+      <w:r>
+        <w:t>4) Сириус</w:t>
+      </w:r>
+    </w:p>
+    <w:p>
+      <w:r>
+        <w:t>5) Фомальгаут</w:t>
+      </w:r>
+    </w:p>
+    <w:p>
+      <w:r>
+        <w:t>2. Какая звезда альфа Больших псов?</w:t>
+      </w:r>
+    </w:p>
+    <w:p>
+      <w:r>
+        <w:t>1) Капелла</w:t>
+      </w:r>
+    </w:p>
+    <w:p>
+      <w:r>
+        <w:t>2) Сириус</w:t>
+      </w:r>
+    </w:p>
+    <w:p>
+      <w:r>
+        <w:t>3) Фомальгаут</w:t>
+      </w:r>
+    </w:p>
+    <w:p>
+      <w:r>
+        <w:t>4) Арктур</w:t>
+      </w:r>
+    </w:p>
+    <w:p>
+      <w:r>
+        <w:t>3. Какой объект находится в каталоге Мессье под номером 45?</w:t>
+      </w:r>
+    </w:p>
+    <w:p>
+      <w:r>
+        <w:t>1) Гиады</w:t>
+      </w:r>
+    </w:p>
+    <w:p>
+      <w:r>
+        <w:t>2) Плеяды</w:t>
+      </w:r>
+    </w:p>
+    <w:p>
+      <w:r>
+        <w:t>3) Туманность Кошачий глаз</w:t>
+      </w:r>
+    </w:p>
+    <w:p>
+      <w:r>
+        <w:t>4) Туманность Ориона</w:t>
+      </w:r>
+    </w:p>
+    <w:p>
+      <w:r>
+        <w:t>5) Крабовидная туманность</w:t>
+      </w:r>
+    </w:p>
+    <w:p>
+      <w:r>
+        <w:t>6) Туманность Андромеды</w:t>
+      </w:r>
+    </w:p>
+    <w:p>
+      <w:r>
+        <w:br w:type="page"/>
+      </w:r>
+    </w:p>
+    <w:p>
+      <w:pPr>
+        <w:jc w:val="center"/>
+      </w:pPr>
+      <w:r>
+        <w:t>Supertest</w:t>
+      </w:r>
+    </w:p>
+    <w:p>
+      <w:pPr>
+        <w:jc w:val="center"/>
+      </w:pPr>
+      <w:r>
+        <w:t>Вариант 25</w:t>
+      </w:r>
+    </w:p>
+    <w:p>
+      <w:r>
+        <w:t>1. Какая звезда альфа Больших псов?</w:t>
+      </w:r>
+    </w:p>
+    <w:p>
+      <w:r>
+        <w:t>1) Фомальгаут</w:t>
+      </w:r>
+    </w:p>
+    <w:p>
+      <w:r>
+        <w:t>2) Сириус</w:t>
+      </w:r>
+    </w:p>
+    <w:p>
+      <w:r>
+        <w:t>3) Арктур</w:t>
+      </w:r>
+    </w:p>
+    <w:p>
+      <w:r>
+        <w:t>4) Капелла</w:t>
+      </w:r>
+    </w:p>
+    <w:p>
+      <w:r>
+        <w:t>2. Какой объект находится в каталоге Мессье под номером 45?</w:t>
+      </w:r>
+    </w:p>
+    <w:p>
+      <w:r>
+        <w:t>1) Туманность Кошачий глаз</w:t>
+      </w:r>
+    </w:p>
+    <w:p>
+      <w:r>
+        <w:t>2) Крабовидная туманность</w:t>
+      </w:r>
+    </w:p>
+    <w:p>
+      <w:r>
+        <w:t>3) Туманность Андромеды</w:t>
+      </w:r>
+    </w:p>
+    <w:p>
+      <w:r>
+        <w:t>4) Гиады</w:t>
+      </w:r>
+    </w:p>
+    <w:p>
+      <w:r>
+        <w:t>5) Туманность Ориона</w:t>
+      </w:r>
+    </w:p>
+    <w:p>
+      <w:r>
+        <w:t>6) Плеяды</w:t>
+      </w:r>
+    </w:p>
+    <w:p>
+      <w:r>
+        <w:t>3. Какая звезда альфа Волопаса?</w:t>
+      </w:r>
+    </w:p>
+    <w:p>
+      <w:r>
+        <w:t>1) Спика</w:t>
+      </w:r>
+    </w:p>
+    <w:p>
+      <w:r>
+        <w:t>2) Арктур</w:t>
+      </w:r>
+    </w:p>
+    <w:p>
+      <w:r>
+        <w:t>3) Сириус</w:t>
+      </w:r>
+    </w:p>
+    <w:p>
+      <w:r>
+        <w:t>4) Фомальгаут</w:t>
+      </w:r>
+    </w:p>
+    <w:p>
+      <w:r>
+        <w:t>5) Капелла</w:t>
+      </w:r>
+    </w:p>
+    <w:p>
+      <w:r>
+        <w:br w:type="page"/>
+      </w:r>
+    </w:p>
+    <w:p>
+      <w:pPr>
+        <w:jc w:val="center"/>
+      </w:pPr>
+      <w:r>
+        <w:t>Supertest</w:t>
+      </w:r>
+    </w:p>
+    <w:p>
+      <w:pPr>
+        <w:jc w:val="center"/>
+      </w:pPr>
+      <w:r>
+        <w:t>Вариант 26</w:t>
+      </w:r>
+    </w:p>
+    <w:p>
+      <w:r>
+        <w:t>1. В каком созвездии находится сверхскопление галактик?</w:t>
+      </w:r>
+    </w:p>
+    <w:p>
+      <w:r>
+        <w:t>1) Эридан</w:t>
+      </w:r>
+    </w:p>
+    <w:p>
+      <w:r>
         <w:t>2) Дева</w:t>
       </w:r>
     </w:p>
     <w:p>
       <w:r>
-        <w:t>3) Эридан</w:t>
-      </w:r>
-    </w:p>
-    <w:p>
-      <w:r>
-        <w:t>4) Большая медведица</w:t>
-      </w:r>
-    </w:p>
-    <w:p>
-      <w:r>
-        <w:t>2. Какая звезда альфа Волопаса?</w:t>
+        <w:t>3) Большая медведица</w:t>
+      </w:r>
+    </w:p>
+    <w:p>
+      <w:r>
+        <w:t>4) Волопас</w:t>
+      </w:r>
+    </w:p>
+    <w:p>
+      <w:r>
+        <w:t>2. Какая звезда альфа Больших псов?</w:t>
+      </w:r>
+    </w:p>
+    <w:p>
+      <w:r>
+        <w:t>1) Фомальгаут</w:t>
+      </w:r>
+    </w:p>
+    <w:p>
+      <w:r>
+        <w:t>2) Арктур</w:t>
+      </w:r>
+    </w:p>
+    <w:p>
+      <w:r>
+        <w:t>3) Сириус</w:t>
+      </w:r>
+    </w:p>
+    <w:p>
+      <w:r>
+        <w:t>4) Капелла</w:t>
+      </w:r>
+    </w:p>
+    <w:p>
+      <w:r>
+        <w:t>3. Какая звезда альфа Волопаса?</w:t>
+      </w:r>
+    </w:p>
+    <w:p>
+      <w:r>
+        <w:t>1) Фомальгаут</w:t>
+      </w:r>
+    </w:p>
+    <w:p>
+      <w:r>
+        <w:t>2) Арктур</w:t>
+      </w:r>
+    </w:p>
+    <w:p>
+      <w:r>
+        <w:t>3) Сириус</w:t>
+      </w:r>
+    </w:p>
+    <w:p>
+      <w:r>
+        <w:t>4) Спика</w:t>
+      </w:r>
+    </w:p>
+    <w:p>
+      <w:r>
+        <w:t>5) Капелла</w:t>
+      </w:r>
+    </w:p>
+    <w:p>
+      <w:r>
+        <w:br w:type="page"/>
+      </w:r>
+    </w:p>
+    <w:p>
+      <w:pPr>
+        <w:jc w:val="center"/>
+      </w:pPr>
+      <w:r>
+        <w:t>Supertest</w:t>
+      </w:r>
+    </w:p>
+    <w:p>
+      <w:pPr>
+        <w:jc w:val="center"/>
+      </w:pPr>
+      <w:r>
+        <w:t>Вариант 27</w:t>
+      </w:r>
+    </w:p>
+    <w:p>
+      <w:r>
+        <w:t>1. Какая звезда альфа Волопаса?</w:t>
+      </w:r>
+    </w:p>
+    <w:p>
+      <w:r>
+        <w:t>1) Сириус</w:t>
+      </w:r>
+    </w:p>
+    <w:p>
+      <w:r>
+        <w:t>2) Спика</w:t>
+      </w:r>
+    </w:p>
+    <w:p>
+      <w:r>
+        <w:t>3) Капелла</w:t>
+      </w:r>
+    </w:p>
+    <w:p>
+      <w:r>
+        <w:t>4) Арктур</w:t>
+      </w:r>
+    </w:p>
+    <w:p>
+      <w:r>
+        <w:t>5) Фомальгаут</w:t>
+      </w:r>
+    </w:p>
+    <w:p>
+      <w:r>
+        <w:t>2. Какая звезда альфа Больших псов?</w:t>
+      </w:r>
+    </w:p>
+    <w:p>
+      <w:r>
+        <w:t>1) Сириус</w:t>
+      </w:r>
+    </w:p>
+    <w:p>
+      <w:r>
+        <w:t>2) Капелла</w:t>
+      </w:r>
+    </w:p>
+    <w:p>
+      <w:r>
+        <w:t>3) Арктур</w:t>
+      </w:r>
+    </w:p>
+    <w:p>
+      <w:r>
+        <w:t>4) Фомальгаут</w:t>
+      </w:r>
+    </w:p>
+    <w:p>
+      <w:r>
+        <w:t>3. Какой объект находится в каталоге Мессье под номером 45?</w:t>
+      </w:r>
+    </w:p>
+    <w:p>
+      <w:r>
+        <w:t>1) Крабовидная туманность</w:t>
+      </w:r>
+    </w:p>
+    <w:p>
+      <w:r>
+        <w:t>2) Туманность Андромеды</w:t>
+      </w:r>
+    </w:p>
+    <w:p>
+      <w:r>
+        <w:t>3) Плеяды</w:t>
+      </w:r>
+    </w:p>
+    <w:p>
+      <w:r>
+        <w:t>4) Гиады</w:t>
+      </w:r>
+    </w:p>
+    <w:p>
+      <w:r>
+        <w:t>5) Туманность Кошачий глаз</w:t>
+      </w:r>
+    </w:p>
+    <w:p>
+      <w:r>
+        <w:t>6) Туманность Ориона</w:t>
+      </w:r>
+    </w:p>
+    <w:p>
+      <w:r>
+        <w:br w:type="page"/>
+      </w:r>
+    </w:p>
+    <w:p>
+      <w:pPr>
+        <w:jc w:val="center"/>
+      </w:pPr>
+      <w:r>
+        <w:t>Supertest</w:t>
+      </w:r>
+    </w:p>
+    <w:p>
+      <w:pPr>
+        <w:jc w:val="center"/>
+      </w:pPr>
+      <w:r>
+        <w:t>Вариант 28</w:t>
+      </w:r>
+    </w:p>
+    <w:p>
+      <w:r>
+        <w:t>1. Какой объект находится в каталоге Мессье под номером 45?</w:t>
+      </w:r>
+    </w:p>
+    <w:p>
+      <w:r>
+        <w:t>1) Плеяды</w:t>
+      </w:r>
+    </w:p>
+    <w:p>
+      <w:r>
+        <w:t>2) Туманность Ориона</w:t>
+      </w:r>
+    </w:p>
+    <w:p>
+      <w:r>
+        <w:t>3) Гиады</w:t>
+      </w:r>
+    </w:p>
+    <w:p>
+      <w:r>
+        <w:t>4) Туманность Андромеды</w:t>
+      </w:r>
+    </w:p>
+    <w:p>
+      <w:r>
+        <w:t>5) Туманность Кошачий глаз</w:t>
+      </w:r>
+    </w:p>
+    <w:p>
+      <w:r>
+        <w:t>6) Крабовидная туманность</w:t>
+      </w:r>
+    </w:p>
+    <w:p>
+      <w:r>
+        <w:t>2. В каком созвездии находится сверхскопление галактик?</w:t>
+      </w:r>
+    </w:p>
+    <w:p>
+      <w:r>
+        <w:t>1) Эридан</w:t>
+      </w:r>
+    </w:p>
+    <w:p>
+      <w:r>
+        <w:t>2) Большая медведица</w:t>
+      </w:r>
+    </w:p>
+    <w:p>
+      <w:r>
+        <w:t>3) Дева</w:t>
+      </w:r>
+    </w:p>
+    <w:p>
+      <w:r>
+        <w:t>4) Волопас</w:t>
+      </w:r>
+    </w:p>
+    <w:p>
+      <w:r>
+        <w:t>3. Какая звезда альфа Больших псов?</w:t>
+      </w:r>
+    </w:p>
+    <w:p>
+      <w:r>
+        <w:t>1) Сириус</w:t>
+      </w:r>
+    </w:p>
+    <w:p>
+      <w:r>
+        <w:t>2) Арктур</w:t>
+      </w:r>
+    </w:p>
+    <w:p>
+      <w:r>
+        <w:t>3) Фомальгаут</w:t>
+      </w:r>
+    </w:p>
+    <w:p>
+      <w:r>
+        <w:t>4) Капелла</w:t>
+      </w:r>
+    </w:p>
+    <w:p>
+      <w:r>
+        <w:br w:type="page"/>
+      </w:r>
+    </w:p>
+    <w:p>
+      <w:pPr>
+        <w:jc w:val="center"/>
+      </w:pPr>
+      <w:r>
+        <w:t>Supertest</w:t>
+      </w:r>
+    </w:p>
+    <w:p>
+      <w:pPr>
+        <w:jc w:val="center"/>
+      </w:pPr>
+      <w:r>
+        <w:t>Вариант 29</w:t>
+      </w:r>
+    </w:p>
+    <w:p>
+      <w:r>
+        <w:t>1. Какая звезда альфа Волопаса?</w:t>
       </w:r>
     </w:p>
     <w:p>
@@ -1089,12 +3043,72 @@
     </w:p>
     <w:p>
       <w:r>
-        <w:t>4) Фомальгаут</w:t>
-      </w:r>
-    </w:p>
-    <w:p>
-      <w:r>
-        <w:t>5) Сириус</w:t>
+        <w:t>4) Сириус</w:t>
+      </w:r>
+    </w:p>
+    <w:p>
+      <w:r>
+        <w:t>5) Фомальгаут</w:t>
+      </w:r>
+    </w:p>
+    <w:p>
+      <w:r>
+        <w:t>2. Какая звезда альфа Больших псов?</w:t>
+      </w:r>
+    </w:p>
+    <w:p>
+      <w:r>
+        <w:t>1) Сириус</w:t>
+      </w:r>
+    </w:p>
+    <w:p>
+      <w:r>
+        <w:t>2) Капелла</w:t>
+      </w:r>
+    </w:p>
+    <w:p>
+      <w:r>
+        <w:t>3) Фомальгаут</w:t>
+      </w:r>
+    </w:p>
+    <w:p>
+      <w:r>
+        <w:t>4) Арктур</w:t>
+      </w:r>
+    </w:p>
+    <w:p>
+      <w:r>
+        <w:t>3. Какой объект находится в каталоге Мессье под номером 45?</w:t>
+      </w:r>
+    </w:p>
+    <w:p>
+      <w:r>
+        <w:t>1) Туманность Ориона</w:t>
+      </w:r>
+    </w:p>
+    <w:p>
+      <w:r>
+        <w:t>2) Туманность Кошачий глаз</w:t>
+      </w:r>
+    </w:p>
+    <w:p>
+      <w:r>
+        <w:t>3) Гиады</w:t>
+      </w:r>
+    </w:p>
+    <w:p>
+      <w:r>
+        <w:t>4) Крабовидная туманность</w:t>
+      </w:r>
+    </w:p>
+    <w:p>
+      <w:r>
+        <w:t>5) Плеяды</w:t>
+      </w:r>
+    </w:p>
+    <w:p>
+      <w:r>
+        <w:t>6) Туманность Андромеды</w:t>
       </w:r>
     </w:p>
     <w:p>
@@ -1103,8 +3117,220 @@
       </w:r>
     </w:p>
     <w:p>
-      <w:r>
-        <w:t>Вар 1. 1 - 5), 2 - 1), Вар 2. 1 - 2), 2 - 4), Вар 3. 1 - 4), 2 - 2), Вар 4. 1 - 3), 2 - 2), Вар 5. 1 - 4), 2 - 3), Вар 6. 1 - 1), 2 - 4), Вар 7. 1 - 5), 2 - 4), Вар 8. 1 - 1), 2 - 1), Вар 9. 1 - 1), 2 - 3), Вар 10. 1 - 3), 2 - 5), Вар 11. 1 - 4), 2 - 2), Вар 12. 1 - 4), 2 - 4), Вар 13. 1 - 4), 2 - 4), Вар 14. 1 - 4), 2 - 1), Вар 15. 1 - 2), 2 - 3)</w:t>
+      <w:pPr>
+        <w:jc w:val="center"/>
+      </w:pPr>
+      <w:r>
+        <w:t>Supertest</w:t>
+      </w:r>
+    </w:p>
+    <w:p>
+      <w:pPr>
+        <w:jc w:val="center"/>
+      </w:pPr>
+      <w:r>
+        <w:t>Вариант 30</w:t>
+      </w:r>
+    </w:p>
+    <w:p>
+      <w:r>
+        <w:t>1. Какая звезда альфа Волопаса?</w:t>
+      </w:r>
+    </w:p>
+    <w:p>
+      <w:r>
+        <w:t>1) Капелла</w:t>
+      </w:r>
+    </w:p>
+    <w:p>
+      <w:r>
+        <w:t>2) Арктур</w:t>
+      </w:r>
+    </w:p>
+    <w:p>
+      <w:r>
+        <w:t>3) Фомальгаут</w:t>
+      </w:r>
+    </w:p>
+    <w:p>
+      <w:r>
+        <w:t>4) Сириус</w:t>
+      </w:r>
+    </w:p>
+    <w:p>
+      <w:r>
+        <w:t>5) Спика</w:t>
+      </w:r>
+    </w:p>
+    <w:p>
+      <w:r>
+        <w:t>2. Какая звезда альфа Больших псов?</w:t>
+      </w:r>
+    </w:p>
+    <w:p>
+      <w:r>
+        <w:t>1) Сириус</w:t>
+      </w:r>
+    </w:p>
+    <w:p>
+      <w:r>
+        <w:t>2) Арктур</w:t>
+      </w:r>
+    </w:p>
+    <w:p>
+      <w:r>
+        <w:t>3) Фомальгаут</w:t>
+      </w:r>
+    </w:p>
+    <w:p>
+      <w:r>
+        <w:t>4) Капелла</w:t>
+      </w:r>
+    </w:p>
+    <w:p>
+      <w:r>
+        <w:t>3. Какой объект находится в каталоге Мессье под номером 45?</w:t>
+      </w:r>
+    </w:p>
+    <w:p>
+      <w:r>
+        <w:t>1) Гиады</w:t>
+      </w:r>
+    </w:p>
+    <w:p>
+      <w:r>
+        <w:t>2) Плеяды</w:t>
+      </w:r>
+    </w:p>
+    <w:p>
+      <w:r>
+        <w:t>3) Туманность Кошачий глаз</w:t>
+      </w:r>
+    </w:p>
+    <w:p>
+      <w:r>
+        <w:t>4) Туманность Андромеды</w:t>
+      </w:r>
+    </w:p>
+    <w:p>
+      <w:r>
+        <w:t>5) Туманность Ориона</w:t>
+      </w:r>
+    </w:p>
+    <w:p>
+      <w:r>
+        <w:t>6) Крабовидная туманность</w:t>
+      </w:r>
+    </w:p>
+    <w:p>
+      <w:r>
+        <w:br w:type="page"/>
+      </w:r>
+    </w:p>
+    <w:p>
+      <w:pPr>
+        <w:jc w:val="center"/>
+      </w:pPr>
+      <w:r>
+        <w:t>Supertest</w:t>
+      </w:r>
+    </w:p>
+    <w:p>
+      <w:pPr>
+        <w:jc w:val="center"/>
+      </w:pPr>
+      <w:r>
+        <w:t>Вариант 31</w:t>
+      </w:r>
+    </w:p>
+    <w:p>
+      <w:r>
+        <w:t>1. Какая звезда альфа Больших псов?</w:t>
+      </w:r>
+    </w:p>
+    <w:p>
+      <w:r>
+        <w:t>1) Фомальгаут</w:t>
+      </w:r>
+    </w:p>
+    <w:p>
+      <w:r>
+        <w:t>2) Арктур</w:t>
+      </w:r>
+    </w:p>
+    <w:p>
+      <w:r>
+        <w:t>3) Сириус</w:t>
+      </w:r>
+    </w:p>
+    <w:p>
+      <w:r>
+        <w:t>4) Капелла</w:t>
+      </w:r>
+    </w:p>
+    <w:p>
+      <w:r>
+        <w:t>2. В каком созвездии находится сверхскопление галактик?</w:t>
+      </w:r>
+    </w:p>
+    <w:p>
+      <w:r>
+        <w:t>1) Эридан</w:t>
+      </w:r>
+    </w:p>
+    <w:p>
+      <w:r>
+        <w:t>2) Большая медведица</w:t>
+      </w:r>
+    </w:p>
+    <w:p>
+      <w:r>
+        <w:t>3) Волопас</w:t>
+      </w:r>
+    </w:p>
+    <w:p>
+      <w:r>
+        <w:t>4) Дева</w:t>
+      </w:r>
+    </w:p>
+    <w:p>
+      <w:r>
+        <w:t>3. Какая звезда альфа Волопаса?</w:t>
+      </w:r>
+    </w:p>
+    <w:p>
+      <w:r>
+        <w:t>1) Капелла</w:t>
+      </w:r>
+    </w:p>
+    <w:p>
+      <w:r>
+        <w:t>2) Фомальгаут</w:t>
+      </w:r>
+    </w:p>
+    <w:p>
+      <w:r>
+        <w:t>3) Спика</w:t>
+      </w:r>
+    </w:p>
+    <w:p>
+      <w:r>
+        <w:t>4) Сириус</w:t>
+      </w:r>
+    </w:p>
+    <w:p>
+      <w:r>
+        <w:t>5) Арктур</w:t>
+      </w:r>
+    </w:p>
+    <w:p>
+      <w:r>
+        <w:br w:type="page"/>
+      </w:r>
+    </w:p>
+    <w:p>
+      <w:r>
+        <w:t>Вар 1. 1 - 2), 2 - 4), 3 - 3), Вар 2. 1 - 6), 2 - 4), 3 - 4), Вар 3. 1 - 2), 2 - 5), 3 - 3), Вар 4. 1 - 1), 2 - 1), 3 - 5), Вар 5. 1 - 2), 2 - 3), 3 - 3), Вар 6. 1 - 3), 2 - 4), 3 - 5), Вар 7. 1 - 1), 2 - 2), 3 - 4), Вар 8. 1 - 3), 2 - 4), 3 - 6), Вар 9. 1 - 4), 2 - 5), 3 - 2), Вар 10. 1 - 1), 2 - 3), 3 - 2), Вар 11. 1 - 2), 2 - 4), 3 - 4), Вар 12. 1 - 2), 2 - 2), 3 - 5), Вар 13. 1 - 2), 2 - 4), 3 - 6), Вар 14. 1 - 2), 2 - 3), 3 - 1), Вар 15. 1 - 2), 2 - 3), 3 - 6), Вар 16. 1 - 4), 2 - 2), 3 - 4), Вар 17. 1 - 1), 2 - 5), 3 - 4), Вар 18. 1 - 4), 2 - 6), 3 - 1), Вар 19. 1 - 5), 2 - 3), 3 - 2), Вар 20. 1 - 1), 2 - 4), 3 - 4), Вар 21. 1 - 4), 2 - 2), 3 - 1), Вар 22. 1 - 2), 2 - 2), 3 - 4), Вар 23. 1 - 3), 2 - 1), 3 - 4), Вар 24. 1 - 3), 2 - 2), 3 - 2), Вар 25. 1 - 2), 2 - 6), 3 - 2), Вар 26. 1 - 2), 2 - 3), 3 - 2), Вар 27. 1 - 4), 2 - 1), 3 - 3), Вар 28. 1 - 1), 2 - 3), 3 - 1), Вар 29. 1 - 3), 2 - 1), 3 - 5), Вар 30. 1 - 2), 2 - 1), 3 - 2), Вар 31. 1 - 3), 2 - 4), 3 - 5)</w:t>
       </w:r>
     </w:p>
     <w:sectPr>

</xml_diff>